<commit_message>
Tese parte 1 (blocos A e B) modelada na Soda Horse 11-12; discovery v1.1 alinha a linha do pó ao preparo
Co-Authored-By: Claude Fable 5.1 <noreply@anthropic.com>
Claude-Session: https://claude.ai/code/session_017HYp1xhSzB6Ui5hyJvLbGE
</commit_message>
<xml_diff>
--- a/analise-ed/copy/VSL_SodaFil_03_Discovery.docx
+++ b/analise-ed/copy/VSL_SodaFil_03_Discovery.docx
@@ -2,13 +2,28 @@
 <file path=word/document.xml><?xml version="1.0" encoding="utf-8"?>
 <w:document xmlns:w="http://schemas.openxmlformats.org/wordprocessingml/2006/main" xmlns:m="http://schemas.openxmlformats.org/officeDocument/2006/math" xmlns:r="http://schemas.openxmlformats.org/officeDocument/2006/relationships" xmlns:o="urn:schemas-microsoft-com:office:office" xmlns:v="urn:schemas-microsoft-com:vml" xmlns:w10="urn:schemas-microsoft-com:office:word" xmlns:a="http://schemas.openxmlformats.org/drawingml/2006/main" xmlns:pic="http://schemas.openxmlformats.org/drawingml/2006/picture" xmlns:wp="http://schemas.openxmlformats.org/drawingml/2006/wordprocessingDrawing">
   <w:body>
-    <w:bookmarkStart w:id="23" w:name="Xe1e1fac48b019fa21ab7e684d4288bc8fe55218"/>
+    <w:bookmarkStart w:id="23" w:name="Xddd73bfde990e825007ccc59b208fbac33110df"/>
     <w:p>
       <w:pPr>
         <w:pStyle w:val="Heading1"/>
       </w:pPr>
       <w:r>
-        <w:t xml:space="preserve">VSL SodaFil — BLOCO 3: DISCOVERY (v1, 12/10/2026)</w:t>
+        <w:t xml:space="preserve">VSL SodaFil — BLOCO 3: DISCOVERY (v1.1, 13/10/2026: linha do pó alinhada à premissa 26 do doc 12,</w:t>
+      </w:r>
+      <w:r>
+        <w:t xml:space="preserve"> </w:t>
+      </w:r>
+      <w:r>
+        <w:t xml:space="preserve">“</w:t>
+      </w:r>
+      <w:r>
+        <w:t xml:space="preserve">o segredo é o preparo</w:t>
+      </w:r>
+      <w:r>
+        <w:t xml:space="preserve">”</w:t>
+      </w:r>
+      <w:r>
+        <w:t xml:space="preserve">)</w:t>
       </w:r>
     </w:p>
     <w:p>
@@ -436,7 +451,7 @@
         <w:t xml:space="preserve"> </w:t>
       </w:r>
       <w:r>
-        <w:t xml:space="preserve">Let me explain how this world works, because this is where everything connects. This is Fort Worth. Longhorn country. You’ve heard it your whole life: everything’s bigger in Texas. You think that’s about the trucks and the steaks. It’s about the bulls. A Longhorn carries horns over a hundred inches wide, and a top breeding bull here sells for 700,000 dollars at auction. Seven hundred thousand. And all of that value sits in one thing: his potency. His ability to get hard, mount, and breed season after season, at 15, at 18 years old, the equivalent of a man of 75. A bull that loses that is worth nothing. Dog food. That’s why the ranchers who run these herds have always kept one thing out of every label, every feed bag, every veterinarian’s manual. A cheap powder. Less than a dollar. That keeps a bull hard and breeding long past the age he should’ve quit.</w:t>
+        <w:t xml:space="preserve">Let me explain how this world works, because this is where everything connects. This is Fort Worth. Longhorn country. You’ve heard it your whole life: everything’s bigger in Texas. You think that’s about the trucks and the steaks. It’s about the bulls. A Longhorn carries horns over a hundred inches wide, and a top breeding bull here sells for 700,000 dollars at auction. Seven hundred thousand. And all of that value sits in one thing: his potency. His ability to get hard, mount, and breed season after season, at 15, at 18 years old, the equivalent of a man of 75. A bull that loses that is worth nothing. Dog food. That’s why the ranchers who run these herds have always kept one thing out of every manual, every feed label, every veterinarian’s handbook. Not the powder. The powder costs less than a dollar and it’s in every feed bag in Texas. What they keep to themselves is how you fix it. Fixed right, it keeps a bull hard and breeding long past the age he should’ve quit.</w:t>
       </w:r>
     </w:p>
     <w:p>
@@ -789,7 +804,7 @@
         <w:t xml:space="preserve"> </w:t>
       </w:r>
       <w:r>
-        <w:t xml:space="preserve">Deixa eu explicar como esse mundo funciona, porque é aqui que tudo se conecta. Isto é Fort Worth. Terra de Longhorn. Você ouviu a vida inteira: tudo é maior no Texas. Você acha que é por causa das caminhonetes e dos bifes. É por causa dos touros. Um Longhorn carrega chifres de mais de cem polegadas de ponta a ponta, e um touro reprodutor de elite aqui sai por 700 mil dólares em leilão. Setecentos mil. E todo esse valor está numa coisa só: a potência dele. A capacidade de ficar duro, montar e cobrir temporada após temporada, aos 15, aos 18 anos, o equivalente a um homem de 75. Um touro que perde isso não vale nada. Ração de cachorro. É por isso que os rancheiros que tocam esses rebanhos sempre deixaram uma coisa fora de todo rótulo, de todo saco de ração, de todo manual de veterinário. Um pó barato. Menos de um dólar. Que mantém o touro duro e cobrindo muito depois da idade em que deveria ter parado.</w:t>
+        <w:t xml:space="preserve">Deixa eu explicar como esse mundo funciona, porque é aqui que tudo se conecta. Isto é Fort Worth. Terra de Longhorn. Você ouviu a vida inteira: tudo é maior no Texas. Você acha que é por causa das caminhonetes e dos bifes. É por causa dos touros. Um Longhorn carrega chifres de mais de cem polegadas de ponta a ponta, e um touro reprodutor de elite aqui sai por 700 mil dólares em leilão. Setecentos mil. E todo esse valor está numa coisa só: a potência dele. A capacidade de ficar duro, montar e cobrir temporada após temporada, aos 15, aos 18 anos, o equivalente a um homem de 75. Um touro que perde isso não vale nada. Ração de cachorro. É por isso que os rancheiros que tocam esses rebanhos sempre deixaram uma coisa fora de todo manual, de todo rótulo de ração, de toda cartilha de veterinário. Não o pó. O pó custa menos de um dólar e está em todo saco de ração do Texas. O que eles guardam pra si é o jeito de preparar. Preparado certo, mantém o touro duro e cobrindo muito depois da idade em que deveria ter parado.</w:t>
       </w:r>
     </w:p>
     <w:p>

</xml_diff>